<commit_message>
Fill the Phase 2 submission template and tidy the mobile layout
- tools/build_submission.py fills the organisers' template into
  docs/RAD-SMART_Phase2_Submission.pptx (team RAD-SMART, code YU8PAK).
- Staff screens on phones: tables become cards, the tab bar scrolls to
  the active tab, notices wrap, and the timeline scrolls sideways.
- Patient page: a full-size standard QR code, the language shown in its
  own script, and tidier help panels.
- Rebuilt the patient phone screenshot, deck PDF and user guide.

Co-Authored-By: Claude Opus 5.5 <noreply@anthropic.com>
</commit_message>
<xml_diff>
--- a/docs/Phase2_Submission.docx
+++ b/docs/Phase2_Submission.docx
@@ -2423,7 +2423,7 @@
                 <w:i w:val="0"/>
                 <w:sz w:val="18"/>
               </w:rPr>
-              <w:t>24 Sep</w:t>
+              <w:t>5 Oct</w:t>
             </w:r>
           </w:p>
         </w:tc>
@@ -2441,7 +2441,7 @@
                 <w:i w:val="0"/>
                 <w:sz w:val="18"/>
               </w:rPr>
-              <w:t>Shortlisted for the build sprint</w:t>
+              <w:t>Shortlisted; the build sprint starts</w:t>
             </w:r>
           </w:p>
         </w:tc>
@@ -6438,6 +6438,70 @@
             </w:pPr>
             <w:r>
               <w:rPr>
+                <w:b/>
+                <w:i w:val="0"/>
+                <w:sz w:val="18"/>
+              </w:rPr>
+              <w:t>The submission in the official template (15 slides)</w:t>
+            </w:r>
+          </w:p>
+        </w:tc>
+        <w:tc>
+          <w:tcPr>
+            <w:tcW w:type="dxa" w:w="4987"/>
+          </w:tcPr>
+          <w:p>
+            <w:pPr>
+              <w:spacing w:after="0"/>
+            </w:pPr>
+            <w:r>
+              <w:rPr>
+                <w:rFonts w:ascii="Consolas" w:hAnsi="Consolas"/>
+                <w:b w:val="0"/>
+                <w:i w:val="0"/>
+                <w:sz w:val="18"/>
+              </w:rPr>
+              <w:t>docs/RAD-SMART_Phase2_Submission.pptx</w:t>
+            </w:r>
+            <w:r>
+              <w:rPr>
+                <w:b w:val="0"/>
+                <w:i w:val="0"/>
+                <w:sz w:val="18"/>
+              </w:rPr>
+              <w:t xml:space="preserve"> (built by </w:t>
+            </w:r>
+            <w:r>
+              <w:rPr>
+                <w:rFonts w:ascii="Consolas" w:hAnsi="Consolas"/>
+                <w:b w:val="0"/>
+                <w:i w:val="0"/>
+                <w:sz w:val="18"/>
+              </w:rPr>
+              <w:t>tools/build_submission.py</w:t>
+            </w:r>
+            <w:r>
+              <w:rPr>
+                <w:b w:val="0"/>
+                <w:i w:val="0"/>
+                <w:sz w:val="18"/>
+              </w:rPr>
+              <w:t>)</w:t>
+            </w:r>
+          </w:p>
+        </w:tc>
+      </w:tr>
+      <w:tr>
+        <w:tc>
+          <w:tcPr>
+            <w:tcW w:type="dxa" w:w="4651"/>
+          </w:tcPr>
+          <w:p>
+            <w:pPr>
+              <w:spacing w:after="0"/>
+            </w:pPr>
+            <w:r>
+              <w:rPr>
                 <w:b w:val="0"/>
                 <w:i w:val="0"/>
                 <w:sz w:val="18"/>

</xml_diff>

<commit_message>
Present the live Azure deployment across every deliverable, and add CI and a licence
- README: badges, links, what it does, an architecture diagram, the stack, and how to run, test and deploy
- Phase 2 submission, its official-template slides, the deck, the website and the technical guide: the app runs live on Microsoft Azure as one Docker image, and the pilot runs the same image with demonstration mode off
- Corrected figures: 112 of 112 translations in four languages (not 140 in five), 30 automated tests, current code sizes, a 12-slide deck
- Technical guide: the real stack (Django and React in CARE, Sarvam AI layer) in place of the Round 1 plan
- Engine tests in poc/tests, run by GitHub Actions on every push
- MIT licence, the same as CARE's

Co-Authored-By: Claude Opus 5.5 <noreply@anthropic.com>
</commit_message>
<xml_diff>
--- a/docs/Phase2_Submission.docx
+++ b/docs/Phase2_Submission.docx
@@ -20,7 +20,7 @@
           <w:b w:val="0"/>
           <w:i w:val="0"/>
         </w:rPr>
-        <w:t>Health-a-thon 2026 · Cancer track · Use case 04: Clinic Operations &amp; Patient Flow · 25 October 2026</w:t>
+        <w:t>Health-a-thon 2026 · Cancer track · Use case 04: Clinic Operations &amp; Patient Flow · 27 October 2026</w:t>
       </w:r>
     </w:p>
     <w:p>
@@ -110,7 +110,21 @@
           <w:b w:val="0"/>
           <w:i w:val="0"/>
         </w:rPr>
-        <w:t>, and is shown in the demo video. Section 4.3 lists what is not built yet. Every patient in the app, the video and the evaluation is synthetic; the department's records are used only as anonymised totals.</w:t>
+        <w:t xml:space="preserve">, is shown in the demo video, and is </w:t>
+      </w:r>
+      <w:r>
+        <w:rPr>
+          <w:b/>
+          <w:i w:val="0"/>
+        </w:rPr>
+        <w:t>live on Microsoft Azure</w:t>
+      </w:r>
+      <w:r>
+        <w:rPr>
+          <w:b w:val="0"/>
+          <w:i w:val="0"/>
+        </w:rPr>
+        <w:t xml:space="preserve"> for anyone to try: https://radsmart.braveglacier-5f9807f7.uaenorth.azurecontainerapps.io/try/ Section 4.3 lists what is not built yet. Every patient in the app, the video and the evaluation is synthetic; the department's records are used only as anonymised totals.</w:t>
       </w:r>
     </w:p>
     <w:p>
@@ -1146,7 +1160,21 @@
           <w:b w:val="0"/>
           <w:i w:val="0"/>
         </w:rPr>
-        <w:t>The MVP is a working application, not a mock-up: a Django backend plugin and a React frontend plugin loaded into CARE (about 3,700 lines of Python and 3,200 lines of TypeScript), on top of the scheduling engine (about 3,700 lines of Python).</w:t>
+        <w:t xml:space="preserve">The MVP is a working application, not a mock-up: a Django backend plugin and a React frontend plugin loaded into CARE (about 3,600 lines of Python and 3,800 lines of TypeScript), on top of the scheduling engine (about 3,700 lines of Python). It is packaged as a Docker container and </w:t>
+      </w:r>
+      <w:r>
+        <w:rPr>
+          <w:b/>
+          <w:i w:val="0"/>
+        </w:rPr>
+        <w:t>deployed live on Microsoft Azure</w:t>
+      </w:r>
+      <w:r>
+        <w:rPr>
+          <w:b w:val="0"/>
+          <w:i w:val="0"/>
+        </w:rPr>
+        <w:t xml:space="preserve"> (Section 7), so the judges can use the same build the department would pilot.</w:t>
       </w:r>
     </w:p>
     <w:tbl>
@@ -1486,6 +1514,14 @@
                 <w:sz w:val="18"/>
               </w:rPr>
               <w:t>Mark sent</w:t>
+            </w:r>
+            <w:r>
+              <w:rPr>
+                <w:b w:val="0"/>
+                <w:i w:val="0"/>
+                <w:sz w:val="18"/>
+              </w:rPr>
+              <w:t>. In the online demonstration a message can also be sent to the visitor's own Telegram, to show it arriving on a phone</w:t>
             </w:r>
           </w:p>
         </w:tc>
@@ -2587,7 +2623,91 @@
                 <w:i w:val="0"/>
                 <w:sz w:val="18"/>
               </w:rPr>
-              <w:t>; Sarvam evaluation; 20 automated safety tests</w:t>
+              <w:t>; Sarvam evaluation; automated safety tests</w:t>
+            </w:r>
+          </w:p>
+        </w:tc>
+      </w:tr>
+      <w:tr>
+        <w:tc>
+          <w:tcPr>
+            <w:tcW w:type="dxa" w:w="1973"/>
+          </w:tcPr>
+          <w:p>
+            <w:pPr>
+              <w:spacing w:after="0"/>
+            </w:pPr>
+            <w:r>
+              <w:rPr>
+                <w:b w:val="0"/>
+                <w:i w:val="0"/>
+                <w:sz w:val="18"/>
+              </w:rPr>
+              <w:t>26 Oct</w:t>
+            </w:r>
+          </w:p>
+        </w:tc>
+        <w:tc>
+          <w:tcPr>
+            <w:tcW w:type="dxa" w:w="7665"/>
+          </w:tcPr>
+          <w:p>
+            <w:pPr>
+              <w:spacing w:after="0"/>
+            </w:pPr>
+            <w:r>
+              <w:rPr>
+                <w:b/>
+                <w:i w:val="0"/>
+                <w:sz w:val="18"/>
+              </w:rPr>
+              <w:t>Deployed live on Microsoft Azure</w:t>
+            </w:r>
+            <w:r>
+              <w:rPr>
+                <w:b w:val="0"/>
+                <w:i w:val="0"/>
+                <w:sz w:val="18"/>
+              </w:rPr>
+              <w:t xml:space="preserve"> in a Docker container (CARE's production build, managed PostgreSQL, HTTPS), with one-click demonstration roles and messages to Telegram; demo video re-recorded on the live server</w:t>
+            </w:r>
+          </w:p>
+        </w:tc>
+      </w:tr>
+      <w:tr>
+        <w:tc>
+          <w:tcPr>
+            <w:tcW w:type="dxa" w:w="1973"/>
+          </w:tcPr>
+          <w:p>
+            <w:pPr>
+              <w:spacing w:after="0"/>
+            </w:pPr>
+            <w:r>
+              <w:rPr>
+                <w:b w:val="0"/>
+                <w:i w:val="0"/>
+                <w:sz w:val="18"/>
+              </w:rPr>
+              <w:t>27 Oct</w:t>
+            </w:r>
+          </w:p>
+        </w:tc>
+        <w:tc>
+          <w:tcPr>
+            <w:tcW w:type="dxa" w:w="7665"/>
+          </w:tcPr>
+          <w:p>
+            <w:pPr>
+              <w:spacing w:after="0"/>
+            </w:pPr>
+            <w:r>
+              <w:rPr>
+                <w:b w:val="0"/>
+                <w:i w:val="0"/>
+                <w:sz w:val="18"/>
+              </w:rPr>
+              <w:t>30 automated tests on the plugin and engine tests run by GitHub on every change</w:t>
             </w:r>
           </w:p>
         </w:tc>
@@ -3248,6 +3368,82 @@
                 <w:i w:val="0"/>
                 <w:sz w:val="18"/>
               </w:rPr>
+              <w:t>Production-grade deployment: one Docker image (CARE's production build, nginx, gunicorn), live on Microsoft Azure with managed PostgreSQL and HTTPS, deployed by one script</w:t>
+            </w:r>
+          </w:p>
+        </w:tc>
+        <w:tc>
+          <w:tcPr>
+            <w:tcW w:type="dxa" w:w="4819"/>
+          </w:tcPr>
+          <w:p>
+            <w:pPr>
+              <w:spacing w:after="0"/>
+            </w:pPr>
+            <w:r>
+              <w:rPr>
+                <w:b/>
+                <w:i w:val="0"/>
+                <w:sz w:val="18"/>
+              </w:rPr>
+              <w:t>Built and running</w:t>
+            </w:r>
+          </w:p>
+        </w:tc>
+      </w:tr>
+      <w:tr>
+        <w:tc>
+          <w:tcPr>
+            <w:tcW w:type="dxa" w:w="4819"/>
+          </w:tcPr>
+          <w:p>
+            <w:pPr>
+              <w:spacing w:after="0"/>
+            </w:pPr>
+            <w:r>
+              <w:rPr>
+                <w:b w:val="0"/>
+                <w:i w:val="0"/>
+                <w:sz w:val="18"/>
+              </w:rPr>
+              <w:t>Hands-on online demonstration: one-click roles, a fresh synthetic day on demand, messages to Telegram</w:t>
+            </w:r>
+          </w:p>
+        </w:tc>
+        <w:tc>
+          <w:tcPr>
+            <w:tcW w:type="dxa" w:w="4819"/>
+          </w:tcPr>
+          <w:p>
+            <w:pPr>
+              <w:spacing w:after="0"/>
+            </w:pPr>
+            <w:r>
+              <w:rPr>
+                <w:b/>
+                <w:i w:val="0"/>
+                <w:sz w:val="18"/>
+              </w:rPr>
+              <w:t>Built and running</w:t>
+            </w:r>
+          </w:p>
+        </w:tc>
+      </w:tr>
+      <w:tr>
+        <w:tc>
+          <w:tcPr>
+            <w:tcW w:type="dxa" w:w="4819"/>
+          </w:tcPr>
+          <w:p>
+            <w:pPr>
+              <w:spacing w:after="0"/>
+            </w:pPr>
+            <w:r>
+              <w:rPr>
+                <w:b w:val="0"/>
+                <w:i w:val="0"/>
+                <w:sz w:val="18"/>
+              </w:rPr>
               <w:t>Sending and receiving automatically through the WhatsApp Business API</w:t>
             </w:r>
           </w:p>
@@ -3563,7 +3759,7 @@
           <w:b w:val="0"/>
           <w:i w:val="0"/>
         </w:rPr>
-        <w:t xml:space="preserve"> Since Round 1 (19 Sep) we built the department's two sets of answers into the engine (standing slots, the 17:00 new-start rule, the 60-minute breakdown rule, roles) and, on 24–25 Oct, a working CARE application with Sarvam messages in four Indian languages (Tulu speakers get Kannada), a patient phone page, QR check-in, plain-language explanations and 20 safety tests. Testing found and fixed four translation and wording problems. Not yet built: automatic WhatsApp sending, spoken replies, a Tulu voice, Excel and prescription import, plain-language rule editing, OIS integration.</w:t>
+        <w:t xml:space="preserve"> Since Round 1 (19 Sep) we built the department's two sets of answers into the engine (standing slots, the 17:00 new-start rule, the 60-minute breakdown rule, roles) and, on 24–25 Oct, a working CARE application with Sarvam messages in four Indian languages (Tulu speakers get Kannada), a patient phone page, QR check-in, plain-language explanations and automated safety tests. On 26 Oct it went live on Microsoft Azure in Docker, open for anyone to try. Testing found and fixed four translation and wording problems. Not yet built: automatic WhatsApp sending, spoken replies, a Tulu voice, Excel and prescription import, plain-language rule editing, OIS integration.</w:t>
       </w:r>
     </w:p>
     <w:p>
@@ -4615,7 +4811,7 @@
                 <w:i w:val="0"/>
                 <w:sz w:val="18"/>
               </w:rPr>
-              <w:t>20 automated tests (no Sarvam calls)</w:t>
+              <w:t>30 automated tests on the plugin (no Sarvam calls), plus engine tests run by GitHub on every change</w:t>
             </w:r>
           </w:p>
         </w:tc>
@@ -5025,7 +5221,7 @@
           <w:b w:val="0"/>
           <w:i w:val="0"/>
         </w:rPr>
-        <w:t xml:space="preserve"> On the department's 55 recorded days, re-planned in a calibrated twin, the 90th-percentile wait fell from 108.6 to 70.4 min (−35%) and over-an-hour lateness from 22.2% to 5.7%. Over 12 synthetic weeks: 82 → 49 min (−40%). After a 150-min breakdown, live re-planning cut the median wait from 104 to 39 min, with a new plan in 14 s. No hard rule was broken. Prediction error 2.15 min; optimum in 7.1 s. Sarvam translations kept every time in 112 of 112 messages across four languages; 20 of 20 explanations accepted with no invented time; 20 safety tests pass. [Technologist trial and native-speaker ratings.] Limits: replay not trial, synthetic session lengths.</w:t>
+        <w:t xml:space="preserve"> On the department's 55 recorded days, re-planned in a calibrated twin, the 90th-percentile wait fell from 108.6 to 70.4 min (−35%) and over-an-hour lateness from 22.2% to 5.7%. Over 12 synthetic weeks: 82 → 49 min (−40%). After a 150-min breakdown, live re-planning cut the median wait from 104 to 39 min, with a new plan in 14 s. No hard rule was broken. Prediction error 2.15 min; optimum in 7.1 s. Sarvam translations kept every time in 112 of 112 messages across four languages; 20 of 20 explanations accepted with no invented time; 30 automated tests pass. [Technologist trial and native-speaker ratings.] Limits: replay not trial, synthetic session lengths.</w:t>
       </w:r>
     </w:p>
     <w:p>
@@ -5300,7 +5496,7 @@
           <w:b w:val="0"/>
           <w:i w:val="0"/>
         </w:rPr>
-        <w:t>Messages are sent from the department's own WhatsApp by a person; no third-party gateway sees patient data in this phase.</w:t>
+        <w:t>Messages are sent from the department's own WhatsApp by a person; no third-party gateway sees patient data in this phase. Telegram is used only in the online demonstration, with synthetic patients.</w:t>
       </w:r>
     </w:p>
     <w:p>
@@ -5427,6 +5623,487 @@
           <w:b w:val="0"/>
           <w:i w:val="0"/>
         </w:rPr>
+        <w:t>Running today: live on Microsoft Azure</w:t>
+      </w:r>
+    </w:p>
+    <w:p>
+      <w:r>
+        <w:rPr>
+          <w:b w:val="0"/>
+          <w:i w:val="0"/>
+        </w:rPr>
+        <w:t xml:space="preserve">RAD-SMART is deployed, not just demonstrated on a laptop. The whole application ships as </w:t>
+      </w:r>
+      <w:r>
+        <w:rPr>
+          <w:b/>
+          <w:i w:val="0"/>
+        </w:rPr>
+        <w:t>one Docker image</w:t>
+      </w:r>
+      <w:r>
+        <w:rPr>
+          <w:b w:val="0"/>
+          <w:i w:val="0"/>
+        </w:rPr>
+        <w:t xml:space="preserve"> and runs on </w:t>
+      </w:r>
+      <w:r>
+        <w:rPr>
+          <w:b/>
+          <w:i w:val="0"/>
+        </w:rPr>
+        <w:t>Microsoft Azure</w:t>
+      </w:r>
+      <w:r>
+        <w:rPr>
+          <w:b w:val="0"/>
+          <w:i w:val="0"/>
+        </w:rPr>
+        <w:t xml:space="preserve"> at https://radsmart.braveglacier-5f9807f7.uaenorth.azurecontainerapps.io/try/.</w:t>
+      </w:r>
+    </w:p>
+    <w:tbl>
+      <w:tblPr>
+        <w:tblStyle w:val="TableGrid"/>
+        <w:tblW w:type="auto" w:w="0"/>
+        <w:jc w:val="center"/>
+        <w:tblLook w:firstColumn="1" w:firstRow="1" w:lastColumn="0" w:lastRow="0" w:noHBand="0" w:noVBand="1" w:val="04A0"/>
+        <w:tblBorders>
+          <w:top w:val="single" w:sz="4" w:space="0" w:color="D5D3CC"/>
+          <w:left w:val="single" w:sz="4" w:space="0" w:color="D5D3CC"/>
+          <w:bottom w:val="single" w:sz="4" w:space="0" w:color="D5D3CC"/>
+          <w:right w:val="single" w:sz="4" w:space="0" w:color="D5D3CC"/>
+          <w:insideH w:val="single" w:sz="4" w:space="0" w:color="D5D3CC"/>
+          <w:insideV w:val="single" w:sz="4" w:space="0" w:color="D5D3CC"/>
+        </w:tblBorders>
+        <w:tblCellMar>
+          <w:top w:w="40" w:type="dxa"/>
+          <w:bottom w:w="40" w:type="dxa"/>
+          <w:left w:w="80" w:type="dxa"/>
+          <w:right w:w="80" w:type="dxa"/>
+        </w:tblCellMar>
+      </w:tblPr>
+      <w:tblGrid>
+        <w:gridCol w:w="4819"/>
+        <w:gridCol w:w="4819"/>
+      </w:tblGrid>
+      <w:tr>
+        <w:tc>
+          <w:tcPr>
+            <w:tcW w:type="dxa" w:w="2983"/>
+            <w:shd w:val="clear" w:color="auto" w:fill="E8EFF9"/>
+          </w:tcPr>
+          <w:p>
+            <w:pPr>
+              <w:spacing w:after="0"/>
+            </w:pPr>
+            <w:r>
+              <w:rPr>
+                <w:b/>
+                <w:i w:val="0"/>
+                <w:sz w:val="18"/>
+              </w:rPr>
+              <w:t>Layer</w:t>
+            </w:r>
+          </w:p>
+        </w:tc>
+        <w:tc>
+          <w:tcPr>
+            <w:tcW w:type="dxa" w:w="6655"/>
+            <w:shd w:val="clear" w:color="auto" w:fill="E8EFF9"/>
+          </w:tcPr>
+          <w:p>
+            <w:pPr>
+              <w:spacing w:after="0"/>
+            </w:pPr>
+            <w:r>
+              <w:rPr>
+                <w:b/>
+                <w:i w:val="0"/>
+                <w:sz w:val="18"/>
+              </w:rPr>
+              <w:t>What runs</w:t>
+            </w:r>
+          </w:p>
+        </w:tc>
+      </w:tr>
+      <w:tr>
+        <w:tc>
+          <w:tcPr>
+            <w:tcW w:type="dxa" w:w="2983"/>
+          </w:tcPr>
+          <w:p>
+            <w:pPr>
+              <w:spacing w:after="0"/>
+            </w:pPr>
+            <w:r>
+              <w:rPr>
+                <w:b w:val="0"/>
+                <w:i w:val="0"/>
+                <w:sz w:val="18"/>
+              </w:rPr>
+              <w:t>Container</w:t>
+            </w:r>
+          </w:p>
+        </w:tc>
+        <w:tc>
+          <w:tcPr>
+            <w:tcW w:type="dxa" w:w="6655"/>
+          </w:tcPr>
+          <w:p>
+            <w:pPr>
+              <w:spacing w:after="0"/>
+            </w:pPr>
+            <w:r>
+              <w:rPr>
+                <w:b w:val="0"/>
+                <w:i w:val="0"/>
+                <w:sz w:val="18"/>
+              </w:rPr>
+              <w:t>One Docker image: CARE's own production build at a pinned version, the RAD-SMART backend and frontend plugins, nginx and gunicorn; built reproducibly from a clean source export, with no secrets inside</w:t>
+            </w:r>
+          </w:p>
+        </w:tc>
+      </w:tr>
+      <w:tr>
+        <w:tc>
+          <w:tcPr>
+            <w:tcW w:type="dxa" w:w="2983"/>
+          </w:tcPr>
+          <w:p>
+            <w:pPr>
+              <w:spacing w:after="0"/>
+            </w:pPr>
+            <w:r>
+              <w:rPr>
+                <w:b w:val="0"/>
+                <w:i w:val="0"/>
+                <w:sz w:val="18"/>
+              </w:rPr>
+              <w:t>Hosting</w:t>
+            </w:r>
+          </w:p>
+        </w:tc>
+        <w:tc>
+          <w:tcPr>
+            <w:tcW w:type="dxa" w:w="6655"/>
+          </w:tcPr>
+          <w:p>
+            <w:pPr>
+              <w:spacing w:after="0"/>
+            </w:pPr>
+            <w:r>
+              <w:rPr>
+                <w:b w:val="0"/>
+                <w:i w:val="0"/>
+                <w:sz w:val="18"/>
+              </w:rPr>
+              <w:t>Azure Container Apps: HTTPS, health checks, scales to zero when idle and back up on the first visit</w:t>
+            </w:r>
+          </w:p>
+        </w:tc>
+      </w:tr>
+      <w:tr>
+        <w:tc>
+          <w:tcPr>
+            <w:tcW w:type="dxa" w:w="2983"/>
+          </w:tcPr>
+          <w:p>
+            <w:pPr>
+              <w:spacing w:after="0"/>
+            </w:pPr>
+            <w:r>
+              <w:rPr>
+                <w:b w:val="0"/>
+                <w:i w:val="0"/>
+                <w:sz w:val="18"/>
+              </w:rPr>
+              <w:t>Database</w:t>
+            </w:r>
+          </w:p>
+        </w:tc>
+        <w:tc>
+          <w:tcPr>
+            <w:tcW w:type="dxa" w:w="6655"/>
+          </w:tcPr>
+          <w:p>
+            <w:pPr>
+              <w:spacing w:after="0"/>
+            </w:pPr>
+            <w:r>
+              <w:rPr>
+                <w:b w:val="0"/>
+                <w:i w:val="0"/>
+                <w:sz w:val="18"/>
+              </w:rPr>
+              <w:t>Azure Database for PostgreSQL (Flexible Server), with automatic daily backups kept for 7 days</w:t>
+            </w:r>
+          </w:p>
+        </w:tc>
+      </w:tr>
+      <w:tr>
+        <w:tc>
+          <w:tcPr>
+            <w:tcW w:type="dxa" w:w="2983"/>
+          </w:tcPr>
+          <w:p>
+            <w:pPr>
+              <w:spacing w:after="0"/>
+            </w:pPr>
+            <w:r>
+              <w:rPr>
+                <w:b w:val="0"/>
+                <w:i w:val="0"/>
+                <w:sz w:val="18"/>
+              </w:rPr>
+              <w:t>Images</w:t>
+            </w:r>
+          </w:p>
+        </w:tc>
+        <w:tc>
+          <w:tcPr>
+            <w:tcW w:type="dxa" w:w="6655"/>
+          </w:tcPr>
+          <w:p>
+            <w:pPr>
+              <w:spacing w:after="0"/>
+            </w:pPr>
+            <w:r>
+              <w:rPr>
+                <w:b w:val="0"/>
+                <w:i w:val="0"/>
+                <w:sz w:val="18"/>
+              </w:rPr>
+              <w:t>Azure Container Registry; every release is a tagged image and the last three are kept, so a rollback is one command</w:t>
+            </w:r>
+          </w:p>
+        </w:tc>
+      </w:tr>
+      <w:tr>
+        <w:tc>
+          <w:tcPr>
+            <w:tcW w:type="dxa" w:w="2983"/>
+          </w:tcPr>
+          <w:p>
+            <w:pPr>
+              <w:spacing w:after="0"/>
+            </w:pPr>
+            <w:r>
+              <w:rPr>
+                <w:b w:val="0"/>
+                <w:i w:val="0"/>
+                <w:sz w:val="18"/>
+              </w:rPr>
+              <w:t>Secrets</w:t>
+            </w:r>
+          </w:p>
+        </w:tc>
+        <w:tc>
+          <w:tcPr>
+            <w:tcW w:type="dxa" w:w="6655"/>
+          </w:tcPr>
+          <w:p>
+            <w:pPr>
+              <w:spacing w:after="0"/>
+            </w:pPr>
+            <w:r>
+              <w:rPr>
+                <w:b w:val="0"/>
+                <w:i w:val="0"/>
+                <w:sz w:val="18"/>
+              </w:rPr>
+              <w:t>Container Apps secrets; the Sarvam key and database password are never in the code or the image</w:t>
+            </w:r>
+          </w:p>
+        </w:tc>
+      </w:tr>
+      <w:tr>
+        <w:tc>
+          <w:tcPr>
+            <w:tcW w:type="dxa" w:w="2983"/>
+          </w:tcPr>
+          <w:p>
+            <w:pPr>
+              <w:spacing w:after="0"/>
+            </w:pPr>
+            <w:r>
+              <w:rPr>
+                <w:b w:val="0"/>
+                <w:i w:val="0"/>
+                <w:sz w:val="18"/>
+              </w:rPr>
+              <w:t>Scheduled job</w:t>
+            </w:r>
+          </w:p>
+        </w:tc>
+        <w:tc>
+          <w:tcPr>
+            <w:tcW w:type="dxa" w:w="6655"/>
+          </w:tcPr>
+          <w:p>
+            <w:pPr>
+              <w:spacing w:after="0"/>
+            </w:pPr>
+            <w:r>
+              <w:rPr>
+                <w:b w:val="0"/>
+                <w:i w:val="0"/>
+                <w:sz w:val="18"/>
+              </w:rPr>
+              <w:t>A daily Container Apps job runs database migrations and renews the synthetic demonstration day</w:t>
+            </w:r>
+          </w:p>
+        </w:tc>
+      </w:tr>
+      <w:tr>
+        <w:tc>
+          <w:tcPr>
+            <w:tcW w:type="dxa" w:w="2983"/>
+          </w:tcPr>
+          <w:p>
+            <w:pPr>
+              <w:spacing w:after="0"/>
+            </w:pPr>
+            <w:r>
+              <w:rPr>
+                <w:b w:val="0"/>
+                <w:i w:val="0"/>
+                <w:sz w:val="18"/>
+              </w:rPr>
+              <w:t>Cost and safety guards</w:t>
+            </w:r>
+          </w:p>
+        </w:tc>
+        <w:tc>
+          <w:tcPr>
+            <w:tcW w:type="dxa" w:w="6655"/>
+          </w:tcPr>
+          <w:p>
+            <w:pPr>
+              <w:spacing w:after="0"/>
+            </w:pPr>
+            <w:r>
+              <w:rPr>
+                <w:b w:val="0"/>
+                <w:i w:val="0"/>
+                <w:sz w:val="18"/>
+              </w:rPr>
+              <w:t>Limits on Sarvam spending per day; a guard that takes the server offline before its free hours run out</w:t>
+            </w:r>
+          </w:p>
+        </w:tc>
+      </w:tr>
+      <w:tr>
+        <w:tc>
+          <w:tcPr>
+            <w:tcW w:type="dxa" w:w="2983"/>
+          </w:tcPr>
+          <w:p>
+            <w:pPr>
+              <w:spacing w:after="0"/>
+            </w:pPr>
+            <w:r>
+              <w:rPr>
+                <w:b w:val="0"/>
+                <w:i w:val="0"/>
+                <w:sz w:val="18"/>
+              </w:rPr>
+              <w:t>Operations</w:t>
+            </w:r>
+          </w:p>
+        </w:tc>
+        <w:tc>
+          <w:tcPr>
+            <w:tcW w:type="dxa" w:w="6655"/>
+          </w:tcPr>
+          <w:p>
+            <w:pPr>
+              <w:spacing w:after="0"/>
+            </w:pPr>
+            <w:r>
+              <w:rPr>
+                <w:b w:val="0"/>
+                <w:i w:val="0"/>
+                <w:sz w:val="18"/>
+              </w:rPr>
+              <w:t>One script (</w:t>
+            </w:r>
+            <w:r>
+              <w:rPr>
+                <w:rFonts w:ascii="Consolas" w:hAnsi="Consolas"/>
+                <w:b w:val="0"/>
+                <w:i w:val="0"/>
+                <w:sz w:val="18"/>
+              </w:rPr>
+              <w:t>deploy/azure/deploy.sh</w:t>
+            </w:r>
+            <w:r>
+              <w:rPr>
+                <w:b w:val="0"/>
+                <w:i w:val="0"/>
+                <w:sz w:val="18"/>
+              </w:rPr>
+              <w:t>) creates, builds, migrates, deploys and checks the whole system</w:t>
+            </w:r>
+          </w:p>
+        </w:tc>
+      </w:tr>
+    </w:tbl>
+    <w:p>
+      <w:pPr>
+        <w:spacing w:after="40"/>
+      </w:pPr>
+    </w:p>
+    <w:p>
+      <w:r>
+        <w:rPr>
+          <w:b w:val="0"/>
+          <w:i w:val="0"/>
+        </w:rPr>
+        <w:t xml:space="preserve">The online server runs in </w:t>
+      </w:r>
+      <w:r>
+        <w:rPr>
+          <w:b/>
+          <w:i w:val="0"/>
+        </w:rPr>
+        <w:t>demonstration mode</w:t>
+      </w:r>
+      <w:r>
+        <w:rPr>
+          <w:b w:val="0"/>
+          <w:i w:val="0"/>
+        </w:rPr>
+        <w:t>: synthetic patients, one-click roles without a password, and a fresh day every morning. Switching to the pilot is configuration, not new code: demonstration mode off, staff sign in with their own CARE accounts, and the database is kept.</w:t>
+      </w:r>
+    </w:p>
+    <w:p>
+      <w:r>
+        <w:rPr>
+          <w:b/>
+          <w:i w:val="0"/>
+        </w:rPr>
+        <w:t>For the pilot</w:t>
+      </w:r>
+      <w:r>
+        <w:rPr>
+          <w:b w:val="0"/>
+          <w:i w:val="0"/>
+        </w:rPr>
+        <w:t>, the same image runs either on the hospital's own server (Docker Compose, beside its CARE) or in an Indian Azure region such as Central India, so patient data stays in India under the DPDP Act. The hospital's IT team chooses; nothing in RAD-SMART changes.</w:t>
+      </w:r>
+    </w:p>
+    <w:p>
+      <w:pPr>
+        <w:pStyle w:val="Heading2"/>
+        <w:keepNext/>
+      </w:pPr>
+      <w:r>
+        <w:rPr>
+          <w:b w:val="0"/>
+          <w:i w:val="0"/>
+        </w:rPr>
         <w:t>Requirements</w:t>
       </w:r>
     </w:p>
@@ -5450,7 +6127,7 @@
           <w:b w:val="0"/>
           <w:i w:val="0"/>
         </w:rPr>
-        <w:t>A CARE instance (the department's, or a hospital VM running CARE with Docker Compose). RAD-SMART installs as a backend and a frontend plugin, with no change to CARE's code.</w:t>
+        <w:t>A CARE instance: the department's own, a hospital VM running CARE with Docker Compose, or our ready-made Docker image on Azure. RAD-SMART installs as a backend and a frontend plugin, with no change to CARE's code.</w:t>
       </w:r>
     </w:p>
     <w:p>
@@ -5634,6 +6311,44 @@
                 <w:sz w:val="18"/>
               </w:rPr>
               <w:t>0 – 1,50,000</w:t>
+            </w:r>
+          </w:p>
+        </w:tc>
+      </w:tr>
+      <w:tr>
+        <w:tc>
+          <w:tcPr>
+            <w:tcW w:type="dxa" w:w="6308"/>
+          </w:tcPr>
+          <w:p>
+            <w:pPr>
+              <w:spacing w:after="0"/>
+            </w:pPr>
+            <w:r>
+              <w:rPr>
+                <w:b w:val="0"/>
+                <w:i w:val="0"/>
+                <w:sz w:val="18"/>
+              </w:rPr>
+              <w:t>Or cloud hosting instead of a server: Azure Central India, one always-on container (0.5 vCPU) and a small managed database</w:t>
+            </w:r>
+          </w:p>
+        </w:tc>
+        <w:tc>
+          <w:tcPr>
+            <w:tcW w:type="dxa" w:w="3330"/>
+          </w:tcPr>
+          <w:p>
+            <w:pPr>
+              <w:spacing w:after="0"/>
+            </w:pPr>
+            <w:r>
+              <w:rPr>
+                <w:b w:val="0"/>
+                <w:i w:val="0"/>
+                <w:sz w:val="18"/>
+              </w:rPr>
+              <w:t>about 4,000 – 6,000 a month</w:t>
             </w:r>
           </w:p>
         </w:tc>
@@ -6004,7 +6719,7 @@
           <w:b w:val="0"/>
           <w:i w:val="0"/>
         </w:rPr>
-        <w:t xml:space="preserve"> Needs a CARE instance (installed as a plugin, no change to CARE), a console and reception device, the department's WhatsApp, and internet for Sarvam (everything else works offline). Costs: hardware ₹0–2.2 lakh (existing PCs or VM cost nothing); Sarvam about ₹3–5 per course, about ₹5,000–10,000 a year; open source, no licence fee. Next integration: a read-only OIS feed. Adoption: a 90-day pilot (baseline, shadow, live, target −25%), then the second machine in 2027 and other CARE hospitals.</w:t>
+        <w:t xml:space="preserve"> Running today on Microsoft Azure as one Docker image (CARE's production build with both plugins, managed PostgreSQL with daily backups, HTTPS, one-script deployment), in demonstration mode; the pilot is the same image with demonstration mode off, on a hospital server or in an Indian Azure region. Needs a CARE instance (installed as a plugin, no change to CARE), a console and reception device, the department's WhatsApp, and internet for Sarvam (everything else works offline). Costs: hardware ₹0–2.2 lakh (existing PCs or VM cost nothing); Sarvam about ₹3–5 per course, about ₹5,000–10,000 a year; open source, no licence fee. Next integration: a read-only OIS feed. Adoption: a 90-day pilot (baseline, shadow, live, target −25%), then the second machine in 2027 and other CARE hospitals.</w:t>
       </w:r>
     </w:p>
     <w:p>
@@ -6390,7 +7105,7 @@
       <w:tr>
         <w:tc>
           <w:tcPr>
-            <w:tcW w:type="dxa" w:w="4651"/>
+            <w:tcW w:type="dxa" w:w="4819"/>
             <w:shd w:val="clear" w:color="auto" w:fill="E8EFF9"/>
           </w:tcPr>
           <w:p>
@@ -6409,7 +7124,7 @@
         </w:tc>
         <w:tc>
           <w:tcPr>
-            <w:tcW w:type="dxa" w:w="4987"/>
+            <w:tcW w:type="dxa" w:w="4819"/>
             <w:shd w:val="clear" w:color="auto" w:fill="E8EFF9"/>
           </w:tcPr>
           <w:p>
@@ -6430,7 +7145,7 @@
       <w:tr>
         <w:tc>
           <w:tcPr>
-            <w:tcW w:type="dxa" w:w="4651"/>
+            <w:tcW w:type="dxa" w:w="4819"/>
           </w:tcPr>
           <w:p>
             <w:pPr>
@@ -6448,7 +7163,7 @@
         </w:tc>
         <w:tc>
           <w:tcPr>
-            <w:tcW w:type="dxa" w:w="4987"/>
+            <w:tcW w:type="dxa" w:w="4819"/>
           </w:tcPr>
           <w:p>
             <w:pPr>
@@ -6494,7 +7209,93 @@
       <w:tr>
         <w:tc>
           <w:tcPr>
-            <w:tcW w:type="dxa" w:w="4651"/>
+            <w:tcW w:type="dxa" w:w="4819"/>
+          </w:tcPr>
+          <w:p>
+            <w:pPr>
+              <w:spacing w:after="0"/>
+            </w:pPr>
+            <w:r>
+              <w:rPr>
+                <w:b/>
+                <w:i w:val="0"/>
+                <w:sz w:val="18"/>
+              </w:rPr>
+              <w:t>The app, live on Microsoft Azure</w:t>
+            </w:r>
+            <w:r>
+              <w:rPr>
+                <w:b w:val="0"/>
+                <w:i w:val="0"/>
+                <w:sz w:val="18"/>
+              </w:rPr>
+              <w:t xml:space="preserve"> (synthetic patients, one click per role)</w:t>
+            </w:r>
+          </w:p>
+        </w:tc>
+        <w:tc>
+          <w:tcPr>
+            <w:tcW w:type="dxa" w:w="4819"/>
+          </w:tcPr>
+          <w:p>
+            <w:pPr>
+              <w:spacing w:after="0"/>
+            </w:pPr>
+            <w:hyperlink r:id="rId10">
+              <w:r>
+                <w:rPr>
+                  <w:color w:val="1C5CAB"/>
+                  <w:u w:val="single"/>
+                </w:rPr>
+                <w:t xml:space="preserve">radsmart…azurecontainerapps.io/try/</w:t>
+              </w:r>
+            </w:hyperlink>
+          </w:p>
+        </w:tc>
+      </w:tr>
+      <w:tr>
+        <w:tc>
+          <w:tcPr>
+            <w:tcW w:type="dxa" w:w="4819"/>
+          </w:tcPr>
+          <w:p>
+            <w:pPr>
+              <w:spacing w:after="0"/>
+            </w:pPr>
+            <w:r>
+              <w:rPr>
+                <w:b w:val="0"/>
+                <w:i w:val="0"/>
+                <w:sz w:val="18"/>
+              </w:rPr>
+              <w:t>How it is deployed (Docker, Azure, one script)</w:t>
+            </w:r>
+          </w:p>
+        </w:tc>
+        <w:tc>
+          <w:tcPr>
+            <w:tcW w:type="dxa" w:w="4819"/>
+          </w:tcPr>
+          <w:p>
+            <w:pPr>
+              <w:spacing w:after="0"/>
+            </w:pPr>
+            <w:r>
+              <w:rPr>
+                <w:rFonts w:ascii="Consolas" w:hAnsi="Consolas"/>
+                <w:b w:val="0"/>
+                <w:i w:val="0"/>
+                <w:sz w:val="18"/>
+              </w:rPr>
+              <w:t>deploy/azure/README.md</w:t>
+            </w:r>
+          </w:p>
+        </w:tc>
+      </w:tr>
+      <w:tr>
+        <w:tc>
+          <w:tcPr>
+            <w:tcW w:type="dxa" w:w="4819"/>
           </w:tcPr>
           <w:p>
             <w:pPr>
@@ -6512,13 +7313,13 @@
         </w:tc>
         <w:tc>
           <w:tcPr>
-            <w:tcW w:type="dxa" w:w="4987"/>
+            <w:tcW w:type="dxa" w:w="4819"/>
           </w:tcPr>
           <w:p>
             <w:pPr>
               <w:spacing w:after="0"/>
             </w:pPr>
-            <w:hyperlink r:id="rId10">
+            <w:hyperlink r:id="rId11">
               <w:r>
                 <w:rPr>
                   <w:color w:val="1C5CAB"/>
@@ -6533,7 +7334,7 @@
       <w:tr>
         <w:tc>
           <w:tcPr>
-            <w:tcW w:type="dxa" w:w="4651"/>
+            <w:tcW w:type="dxa" w:w="4819"/>
           </w:tcPr>
           <w:p>
             <w:pPr>
@@ -6551,13 +7352,13 @@
         </w:tc>
         <w:tc>
           <w:tcPr>
-            <w:tcW w:type="dxa" w:w="4987"/>
+            <w:tcW w:type="dxa" w:w="4819"/>
           </w:tcPr>
           <w:p>
             <w:pPr>
               <w:spacing w:after="0"/>
             </w:pPr>
-            <w:hyperlink r:id="rId11">
+            <w:hyperlink r:id="rId12">
               <w:r>
                 <w:rPr>
                   <w:color w:val="1C5CAB"/>
@@ -6589,7 +7390,7 @@
       <w:tr>
         <w:tc>
           <w:tcPr>
-            <w:tcW w:type="dxa" w:w="4651"/>
+            <w:tcW w:type="dxa" w:w="4819"/>
           </w:tcPr>
           <w:p>
             <w:pPr>
@@ -6607,13 +7408,13 @@
         </w:tc>
         <w:tc>
           <w:tcPr>
-            <w:tcW w:type="dxa" w:w="4987"/>
+            <w:tcW w:type="dxa" w:w="4819"/>
           </w:tcPr>
           <w:p>
             <w:pPr>
               <w:spacing w:after="0"/>
             </w:pPr>
-            <w:hyperlink r:id="rId12">
+            <w:hyperlink r:id="rId13">
               <w:r>
                 <w:rPr>
                   <w:color w:val="1C5CAB"/>
@@ -6628,7 +7429,7 @@
       <w:tr>
         <w:tc>
           <w:tcPr>
-            <w:tcW w:type="dxa" w:w="4651"/>
+            <w:tcW w:type="dxa" w:w="4819"/>
           </w:tcPr>
           <w:p>
             <w:pPr>
@@ -6646,13 +7447,13 @@
         </w:tc>
         <w:tc>
           <w:tcPr>
-            <w:tcW w:type="dxa" w:w="4987"/>
+            <w:tcW w:type="dxa" w:w="4819"/>
           </w:tcPr>
           <w:p>
             <w:pPr>
               <w:spacing w:after="0"/>
             </w:pPr>
-            <w:hyperlink r:id="rId13">
+            <w:hyperlink r:id="rId14">
               <w:r>
                 <w:rPr>
                   <w:color w:val="1C5CAB"/>
@@ -6667,7 +7468,7 @@
       <w:tr>
         <w:tc>
           <w:tcPr>
-            <w:tcW w:type="dxa" w:w="4651"/>
+            <w:tcW w:type="dxa" w:w="4819"/>
           </w:tcPr>
           <w:p>
             <w:pPr>
@@ -6685,7 +7486,7 @@
         </w:tc>
         <w:tc>
           <w:tcPr>
-            <w:tcW w:type="dxa" w:w="4987"/>
+            <w:tcW w:type="dxa" w:w="4819"/>
           </w:tcPr>
           <w:p>
             <w:pPr>
@@ -6706,7 +7507,7 @@
       <w:tr>
         <w:tc>
           <w:tcPr>
-            <w:tcW w:type="dxa" w:w="4651"/>
+            <w:tcW w:type="dxa" w:w="4819"/>
           </w:tcPr>
           <w:p>
             <w:pPr>
@@ -6724,7 +7525,7 @@
         </w:tc>
         <w:tc>
           <w:tcPr>
-            <w:tcW w:type="dxa" w:w="4987"/>
+            <w:tcW w:type="dxa" w:w="4819"/>
           </w:tcPr>
           <w:p>
             <w:pPr>
@@ -6745,7 +7546,7 @@
       <w:tr>
         <w:tc>
           <w:tcPr>
-            <w:tcW w:type="dxa" w:w="4651"/>
+            <w:tcW w:type="dxa" w:w="4819"/>
           </w:tcPr>
           <w:p>
             <w:pPr>
@@ -6763,7 +7564,7 @@
         </w:tc>
         <w:tc>
           <w:tcPr>
-            <w:tcW w:type="dxa" w:w="4987"/>
+            <w:tcW w:type="dxa" w:w="4819"/>
           </w:tcPr>
           <w:p>
             <w:pPr>
@@ -6784,7 +7585,7 @@
       <w:tr>
         <w:tc>
           <w:tcPr>
-            <w:tcW w:type="dxa" w:w="4651"/>
+            <w:tcW w:type="dxa" w:w="4819"/>
           </w:tcPr>
           <w:p>
             <w:pPr>
@@ -6802,7 +7603,7 @@
         </w:tc>
         <w:tc>
           <w:tcPr>
-            <w:tcW w:type="dxa" w:w="4987"/>
+            <w:tcW w:type="dxa" w:w="4819"/>
           </w:tcPr>
           <w:p>
             <w:pPr>
@@ -6823,7 +7624,7 @@
       <w:tr>
         <w:tc>
           <w:tcPr>
-            <w:tcW w:type="dxa" w:w="4651"/>
+            <w:tcW w:type="dxa" w:w="4819"/>
           </w:tcPr>
           <w:p>
             <w:pPr>
@@ -6841,7 +7642,7 @@
         </w:tc>
         <w:tc>
           <w:tcPr>
-            <w:tcW w:type="dxa" w:w="4987"/>
+            <w:tcW w:type="dxa" w:w="4819"/>
           </w:tcPr>
           <w:p>
             <w:pPr>
@@ -6862,7 +7663,7 @@
       <w:tr>
         <w:tc>
           <w:tcPr>
-            <w:tcW w:type="dxa" w:w="4651"/>
+            <w:tcW w:type="dxa" w:w="4819"/>
           </w:tcPr>
           <w:p>
             <w:pPr>
@@ -6874,13 +7675,13 @@
                 <w:i w:val="0"/>
                 <w:sz w:val="18"/>
               </w:rPr>
-              <w:t>Safety tests</w:t>
+              <w:t>Automated tests</w:t>
             </w:r>
           </w:p>
         </w:tc>
         <w:tc>
           <w:tcPr>
-            <w:tcW w:type="dxa" w:w="4987"/>
+            <w:tcW w:type="dxa" w:w="4819"/>
           </w:tcPr>
           <w:p>
             <w:pPr>
@@ -6893,7 +7694,32 @@
                 <w:i w:val="0"/>
                 <w:sz w:val="18"/>
               </w:rPr>
-              <w:t>app/care_radsmart/care_radsmart/tests/test_sarvam.py</w:t>
+              <w:t>app/care_radsmart/care_radsmart/tests/</w:t>
+            </w:r>
+            <w:r>
+              <w:rPr>
+                <w:b w:val="0"/>
+                <w:i w:val="0"/>
+                <w:sz w:val="18"/>
+              </w:rPr>
+              <w:t xml:space="preserve"> (30 tests) · </w:t>
+            </w:r>
+            <w:r>
+              <w:rPr>
+                <w:rFonts w:ascii="Consolas" w:hAnsi="Consolas"/>
+                <w:b w:val="0"/>
+                <w:i w:val="0"/>
+                <w:sz w:val="18"/>
+              </w:rPr>
+              <w:t>poc/tests/</w:t>
+            </w:r>
+            <w:r>
+              <w:rPr>
+                <w:b w:val="0"/>
+                <w:i w:val="0"/>
+                <w:sz w:val="18"/>
+              </w:rPr>
+              <w:t xml:space="preserve"> (run by GitHub on every change)</w:t>
             </w:r>
           </w:p>
         </w:tc>

</xml_diff>